<commit_message>
CASSIA v0.2 revised manuscript, response to reviewer and supplement
Full rerun: 3-database chemistry, 15,000-study multi-mechanism benchmark,
identifiability engine (Fisher, detection, equivalence, profiles),
20-corpus ML validation, study-level conformal intervals, two-endpoint
design with test-confirmed protocol, missing-chemistry propagation.
Elsevier-format Word files for manuscript, highlights, supplement and
point-by-point response.

Co-Authored-By: Claude Opus 5.5 <noreply@anthropic.com>
Claude-Session: https://claude.ai/code/session_01GFzJmQTFtMep2it1kYJtwA
</commit_message>
<xml_diff>
--- a/cassia/manuscript/CASSIA_highlights.docx
+++ b/cassia/manuscript/CASSIA_highlights.docx
@@ -24,7 +24,7 @@
         <w:spacing w:line="480" w:lineRule="auto"/>
       </w:pPr>
       <w:r>
-        <w:t xml:space="preserve">Loss of dissolved Cr(VI) on carbons is not, by itself, evidence of adsorption</w:t>
+        <w:t xml:space="preserve">Residual Cr(VI) data seldom rule out adsorption-only fits when reduction dominates</w:t>
       </w:r>
     </w:p>
     <w:p>
@@ -37,7 +37,7 @@
         <w:spacing w:line="480" w:lineRule="auto"/>
       </w:pPr>
       <w:r>
-        <w:t xml:space="preserve">Two PHREEQC databases agree on Cr(VI) speciation but not on Cr(VI)/Cr(III) redox</w:t>
+        <w:t xml:space="preserve">Total-Cr and XPS data make reduction detectable, defining evidence classes B and A</w:t>
       </w:r>
     </w:p>
     <w:p>
@@ -50,7 +50,7 @@
         <w:spacing w:line="480" w:lineRule="auto"/>
       </w:pPr>
       <w:r>
-        <w:t xml:space="preserve">Isotherm fits with R² ≥ 0.95 concealed reduction shares of up to 56%</w:t>
+        <w:t xml:space="preserve">Three PHREEQC databases differ by 63–83 mV in the Cr(VI)/Cr(III) redox boundary</w:t>
       </w:r>
     </w:p>
     <w:p>
@@ -63,16 +63,7 @@
         <w:spacing w:line="480" w:lineRule="auto"/>
       </w:pPr>
       <w:r>
-        <w:t xml:space="preserve">Langmuir q</w:t>
-      </w:r>
-      <w:r>
-        <w:rPr>
-          <w:vertAlign w:val="subscript"/>
-        </w:rPr>
-        <w:t xml:space="preserve">max</w:t>
-      </w:r>
-      <w:r>
-        <w:t xml:space="preserve"> overstated true Cr(VI) adsorption capacity by up to three-fold</w:t>
+        <w:t xml:space="preserve">Study-level conformal intervals cover 88–93% of new studies but span ≥2 log units</w:t>
       </w:r>
     </w:p>
     <w:p>
@@ -85,7 +76,7 @@
         <w:spacing w:line="480" w:lineRule="auto"/>
       </w:pPr>
       <w:r>
-        <w:t xml:space="preserve">Study-aware conformal intervals restored nominal coverage for unseen studies</w:t>
+        <w:t xml:space="preserve">Model-guided, test-confirmed design avoided all unsafe effluent recommendations</w:t>
       </w:r>
     </w:p>
     <w:sectPr>
@@ -271,6 +262,15 @@
       <w:lvlJc w:val="left"/>
       <w:pPr>
         <w:ind w:left="567" w:hanging="340"/>
+      </w:pPr>
+    </w:lvl>
+    <w:lvl w:ilvl="1" w15:tentative="1">
+      <w:start w:val="1"/>
+      <w:numFmt w:val="bullet"/>
+      <w:lvlText w:val="–"/>
+      <w:lvlJc w:val="left"/>
+      <w:pPr>
+        <w:ind w:left="1134" w:hanging="340"/>
       </w:pPr>
     </w:lvl>
   </w:abstractNum>

</xml_diff>

<commit_message>
Word build: appendix math conversion, sub/superscripts, centred equations; OC script
Co-Authored-By: Claude Opus 5.5 <noreply@anthropic.com>
Claude-Session: https://claude.ai/code/session_01GFzJmQTFtMep2it1kYJtwA
</commit_message>
<xml_diff>
--- a/cassia/manuscript/CASSIA_highlights.docx
+++ b/cassia/manuscript/CASSIA_highlights.docx
@@ -24,7 +24,7 @@
         <w:spacing w:line="480" w:lineRule="auto"/>
       </w:pPr>
       <w:r>
-        <w:t xml:space="preserve">Residual Cr(VI) data seldom rule out adsorption-only fits when reduction dominates</w:t>
+        <w:t xml:space="preserve">Simulated Cr(VI)-only data were often equivalent to adsorption-only fits within 10%</w:t>
       </w:r>
     </w:p>
     <w:p>
@@ -37,7 +37,7 @@
         <w:spacing w:line="480" w:lineRule="auto"/>
       </w:pPr>
       <w:r>
-        <w:t xml:space="preserve">Total-Cr and XPS data make reduction detectable, defining evidence classes B and A</w:t>
+        <w:t xml:space="preserve">In the benchmark, total-Cr and solid-phase data raised rejection power to 80–96%</w:t>
       </w:r>
     </w:p>
     <w:p>
@@ -50,7 +50,7 @@
         <w:spacing w:line="480" w:lineRule="auto"/>
       </w:pPr>
       <w:r>
-        <w:t xml:space="preserve">Three PHREEQC databases differ by 63–83 mV in the Cr(VI)/Cr(III) redox boundary</w:t>
+        <w:t xml:space="preserve">PHREEQC databases differ by 63–83 mV in the Cr(VI)/Cr(III) redox boundary</w:t>
       </w:r>
     </w:p>
     <w:p>
@@ -63,7 +63,7 @@
         <w:spacing w:line="480" w:lineRule="auto"/>
       </w:pPr>
       <w:r>
-        <w:t xml:space="preserve">Study-level conformal intervals cover 88–93% of new studies but span ≥2 log units</w:t>
+        <w:t xml:space="preserve">Exact study-level conformal intervals hold coverage but span over 3 log units</w:t>
       </w:r>
     </w:p>
     <w:p>
@@ -76,7 +76,7 @@
         <w:spacing w:line="480" w:lineRule="auto"/>
       </w:pPr>
       <w:r>
-        <w:t xml:space="preserve">Model-guided, test-confirmed design avoided all unsafe effluent recommendations</w:t>
+        <w:t xml:space="preserve">No unsafe accepted designs were observed in the simulated test cohorts</w:t>
       </w:r>
     </w:p>
     <w:sectPr>

</xml_diff>

<commit_message>
Revision 4 deliverables: manuscript, supplement (S1 regenerated, S5b, S14), response to fourth review (docx); code commit 72a0b17
Co-Authored-By: Claude Opus 5.5 <noreply@anthropic.com>
Claude-Session: https://claude.ai/code/session_01GFzJmQTFtMep2it1kYJtwA
</commit_message>
<xml_diff>
--- a/cassia/manuscript/CASSIA_highlights.docx
+++ b/cassia/manuscript/CASSIA_highlights.docx
@@ -24,7 +24,7 @@
         <w:spacing w:line="480" w:lineRule="auto"/>
       </w:pPr>
       <w:r>
-        <w:t xml:space="preserve">Simulated Cr(VI)-only data were often equivalent to adsorption-only fits within 10%</w:t>
+        <w:t xml:space="preserve">Known-truth benchmark of what Cr(VI)-removal data can show about mechanism</w:t>
       </w:r>
     </w:p>
     <w:p>
@@ -37,7 +37,7 @@
         <w:spacing w:line="480" w:lineRule="auto"/>
       </w:pPr>
       <w:r>
-        <w:t xml:space="preserve">In the benchmark, total-Cr and solid-phase data raised rejection power to 80–96%</w:t>
+        <w:t xml:space="preserve">Simulated Cr(VI)-only data were often equivalent to adsorption-only fits within 10%</w:t>
       </w:r>
     </w:p>
     <w:p>
@@ -50,7 +50,7 @@
         <w:spacing w:line="480" w:lineRule="auto"/>
       </w:pPr>
       <w:r>
-        <w:t xml:space="preserve">PHREEQC databases differ by 63–83 mV in the Cr(VI)/Cr(III) redox boundary</w:t>
+        <w:t xml:space="preserve">At about 5% type-I error, total-Cr and solid-phase data gave 80–98% rejection power</w:t>
       </w:r>
     </w:p>
     <w:p>
@@ -63,7 +63,7 @@
         <w:spacing w:line="480" w:lineRule="auto"/>
       </w:pPr>
       <w:r>
-        <w:t xml:space="preserve">Exact study-level conformal intervals hold coverage but span over 3 log units</w:t>
+        <w:t xml:space="preserve">Exact study-level coverage holds; intervals are too wide for some engineering uses</w:t>
       </w:r>
     </w:p>
     <w:p>

</xml_diff>